<commit_message>
Add Flask campus event application
Co-authored-by: Copilot App <223556219+Copilot@users.noreply.github.com>
</commit_message>
<xml_diff>
--- a/Campus_Event_Club_Management_System_Report.docx
+++ b/Campus_Event_Club_Management_System_Report.docx
@@ -295,7 +295,7 @@
           </w:tcPr>
           <w:p>
             <w:r>
-              <w:t>registration_no, email unique; department_id → Department</w:t>
+              <w:t>registration_no, email unique; department_id → Department; password_hash for app login</w:t>
             </w:r>
           </w:p>
         </w:tc>
@@ -306,7 +306,7 @@
           </w:tcPr>
           <w:p>
             <w:r>
-              <w:t>Student identity and academic department</w:t>
+              <w:t>Student identity, department, and password hash for the Flask app</w:t>
             </w:r>
           </w:p>
         </w:tc>
@@ -536,7 +536,7 @@
           </w:tcPr>
           <w:p>
             <w:r>
-              <w:t>Schedule, event capacity, approval state, and budget limit</w:t>
+              <w:t>Schedule, event capacity, approval state, budget limit, and optional fun fact</w:t>
             </w:r>
           </w:p>
         </w:tc>
@@ -1186,7 +1186,7 @@
     </w:p>
     <w:p>
       <w:r>
-        <w:t>Use a MySQL 8.0+ or MariaDB 10.5+ account with permission to create a database, tables, triggers, procedures, and views. The setup SQL creates campus_event_club_db if needed and does not drop or overwrite an existing schema. It is intended for a fresh schema; running it a second time against the populated schema will encounter existing objects. To rebuild, remove the project schema yourself after backing up anything you need.</w:t>
+        <w:t>Use a MySQL 8.0+ or MariaDB 10.5+ account with permission to create a database, tables, triggers, procedures, and views. The supplied MySQL dump creates campus_event_club_db if needed, then drops and recreates the project tables before inserting sample rows. Running it deletes existing project data; back up anything you need first.</w:t>
       </w:r>
     </w:p>
     <w:p>

</xml_diff>